<commit_message>
Elevate manuscript prose and fix factual or stylistic errors.
Clarify PAC title scope, verify statistics against outputs, remove repo
paths from main text, and add internal QA audit document.

Co-authored-by: Cursor <cursoragent@cursor.com>
</commit_message>
<xml_diff>
--- a/manuscript/MANUSCRIPT_draft.docx
+++ b/manuscript/MANUSCRIPT_draft.docx
@@ -72,7 +72,7 @@
           <w:i w:val="0"/>
           <w:sz w:val="22"/>
         </w:rPr>
-        <w:t>Resistance to systemic therapy remains the leading cause of cancer mortality, yet decisions at diagnosis rarely incorporate a quantitative estimate of whether a tumour can evolve resistance on the planned regimen. Here we define N_e*, a resistance-learnability threshold computable from standard tumour sequencing. N_e* depends on three inputs already reported or derivable from most profiling panels: subclonal diversity (V_A), effective population size (N_e), and an independently specified count of resistance-relevant driver loci (L). It marks the minimum heritable population size required for evolution to produce fit resistant clones within a fixed tolerance (ε = 0.05) with bounded failure probability (δ = 0.05).</w:t>
+        <w:t>Resistance to systemic therapy drives most cancer deaths, yet treatment decisions at diagnosis seldom include a quantitative estimate of evolutionary capacity to escape therapy. We define N_e*, a resistance-learnability threshold computable from standard tumour sequencing: subclonal diversity (V_A), effective population size (N_e), and an independently specified count of resistance-relevant driver loci (L). Under a fixed evolutionary tolerance (ε = 0.05) and failure probability (δ = 0.05), N_e* is the minimum population size at which resistance evolution is reliably learnable in the PAC sense (Supplementary Note 1).</w:t>
       </w:r>
     </w:p>
     <w:p>
@@ -86,7 +86,7 @@
           <w:i w:val="0"/>
           <w:sz w:val="22"/>
         </w:rPr>
-        <w:t>Across seventeen cancer types, the theoretical PAC bound ε*(N_e, V_A, L) correlates with published resistance durability (Pearson r = 0.88, P = 3.1 × 10⁻⁶; leave-one-out minimum r = 0.77), providing pan-cancer ecological validation without patient-level outcome fitting. In the largest public vemurafenib cohort with resistance-specific annotations (n = 45), pre-registered association of log(N_e/N_e*) with duration on drug was null (Cox hazard ratio 0.97, P = 0.97), consistent with limited events and calibration placing 44 of 45 patients below N_e*. Among 1,564 sequenced patients, N_e* was computable from existing report fields; 2–28% exceeded the threshold depending on indication.</w:t>
+        <w:t>Across seventeen cancer types, the bound ε*(N_e, V_A, L) correlates with published resistance durability (Pearson r = 0.88, P = 3.1 × 10⁻⁶; leave-one-out minimum r = 0.77), validating pan-cancer resistance ecology without patient-level outcome fitting. In the largest public vemurafenib cohort with resistance-specific annotations (n = 45), pre-registered association of log(N_e/N_e*) with duration on drug was null (Cox hazard ratio 0.97, 95% CI 0.20–4.71, P = 0.97), consistent with fourteen events and 44 of 45 patients below N_e* after calibration. Among 1,564 sequenced patients, all inputs were available from existing report fields; 2–28% exceeded N_e* depending on indication.</w:t>
       </w:r>
     </w:p>
     <w:p>
@@ -100,7 +100,7 @@
           <w:i w:val="0"/>
           <w:sz w:val="22"/>
         </w:rPr>
-        <w:t>N_e* offers a pre-treatment evolutionary risk readout—not a treatment algorithm and not causal proof of manipulability. Pre-registered generic progression-free survival analyses were null, highlighting the need for resistance-dated endpoints in prospective validation.</w:t>
+        <w:t>N_e* is a pre-treatment evolutionary risk readout, not a treatment algorithm or proof that N_e is causally manipulable. Pre-registered generic progression-free survival analyses were null (log-rank P = 0.55), underscoring the need for resistance-dated endpoints in prospective validation.</w:t>
       </w:r>
     </w:p>
     <w:p>
@@ -137,7 +137,7 @@
         <w:rPr>
           <w:sz w:val="22"/>
         </w:rPr>
-        <w:t>N_e* is a resistance-learnability threshold computable from V_A, N_e, and L on standard sequencing reports.</w:t>
+        <w:t>N_e* quantifies resistance learnability from V_A, N_e, and L already present on most sequencing reports.</w:t>
       </w:r>
     </w:p>
     <w:p>
@@ -149,7 +149,7 @@
         <w:rPr>
           <w:sz w:val="22"/>
         </w:rPr>
-        <w:t>ε* tracks resistance durability across 17 cancer types (r = 0.88), independent of patient-level tuning.</w:t>
+        <w:t>ε* tracks resistance durability across 17 cancer types (r = 0.88), with no patient-level tuning.</w:t>
       </w:r>
     </w:p>
     <w:p>
@@ -161,7 +161,7 @@
         <w:rPr>
           <w:sz w:val="22"/>
         </w:rPr>
-        <w:t>Targeted-therapy patient validation on public data was null but pre-specified; best cohorts lack resistance dates.</w:t>
+        <w:t>Public targeted-therapy cohorts yield a pre-specified null patient test; resistance-dated endpoints are scarce.</w:t>
       </w:r>
     </w:p>
     <w:p>
@@ -173,7 +173,7 @@
         <w:rPr>
           <w:sz w:val="22"/>
         </w:rPr>
-        <w:t>Clinical deployment requires no new assay; binary above/below calls are indication-specific and often rare.</w:t>
+        <w:t>Binary above/below calls are indication-specific and often rare; continuous log(N_e/N_e*) is preferred.</w:t>
       </w:r>
     </w:p>
     <w:p>
@@ -198,7 +198,7 @@
           <w:i w:val="0"/>
           <w:sz w:val="22"/>
         </w:rPr>
-        <w:t>Most deaths from advanced cancer follow the emergence of drug-resistant disease. Clinicians choose regimens using histology, molecular drivers, and staging, but rarely receive a number that answers a distinct evolutionary question: does this tumour harbour enough heritable variation, in enough cells, across enough resistance pathways to learn an escape genotype before control is lost? That question is increasingly addressable because baseline tumour sequencing—whole-exome, whole-genome, or large targeted panels—already quantifies subclonal structure through mutation allele frequencies (VAFs), purity estimates, and driver annotations.</w:t>
+        <w:t>Advanced cancer kills most often when tumours evolve drug resistance. Oncologists select regimens from histology, driver mutations, and stage, but a separate question usually goes unquantified: does this tumour contain enough heritable variation, in enough cells, across enough resistance pathways to discover an escape genotype before the current therapy fails? Baseline tumour sequencing—exome, genome, or large targeted panel—already contains the information needed to approach that question through mutation allele frequencies (VAFs), purity estimates, and driver annotations.</w:t>
       </w:r>
     </w:p>
     <w:p>
@@ -212,7 +212,7 @@
           <w:i w:val="0"/>
           <w:sz w:val="22"/>
         </w:rPr>
-        <w:t>Population-genetic theory treats resistance as search on a fitness landscape. Beneficial alleles must be present or arise in a population large enough to be sampled under selection. Effective population size N_e summarises that sampling capacity; subclonal diversity V_A captures how unevenly mutations are distributed across cellular subpopulations; and the number of independently mutable resistance loci L sets the dimensionality of the search. Together, these quantities determine whether evolution can approximate an ε-optimal resistant phenotype with high probability.</w:t>
+        <w:t>From a population-genetic perspective, resistance is search on a fitness landscape under selection. Beneficial alleles must be present or arise in a population large enough to be sampled before sensitive clones are eliminated. Effective population size N_e governs that sampling capacity; subclonal diversity V_A describes how unevenly mutations partition across cellular subpopulations; and the number of independently mutable resistance loci L defines search dimensionality. Together they determine whether evolution can approximate an ε-optimal resistant phenotype with bounded error.</w:t>
       </w:r>
     </w:p>
     <w:p>
@@ -226,7 +226,7 @@
           <w:i w:val="0"/>
           <w:sz w:val="22"/>
         </w:rPr>
-        <w:t>We formalise this logic with an evolutionary probably approximately correct (PAC) bound (Supplementary Note 1). For tolerance ε and failure probability δ, there exists a minimum N_e*(V_A, L) below which resistance evolution is sample-starved. The bound defines a computable ε*(N_e, V_A, L) that should covary with resistance emergence rates when inputs are measured independently of outcomes. A critical design choice is that L is taken from curated driver panels (OncoKB/CIViC tiered loci) and is not set equal to log₂(N_e), avoiding circular coupling between threshold inputs and population-size estimates.</w:t>
+        <w:t>We cast this logic as an evolutionary probably approximately correct (PAC) bound (Supplementary Note 1). For fixed ε and δ there exists a minimum N_e*(V_A, L) below which resistance evolution is sample-starved. The bound yields ε*(N_e, V_A, L), which should covary with resistance emergence when its inputs are measured independently of clinical outcome. Importantly, L is fixed from curated OncoKB/CIViC resistance panels and is not derived from log₂(N_e), avoiding circular coupling between the threshold and the population size estimate.</w:t>
       </w:r>
     </w:p>
     <w:p>
@@ -240,7 +240,7 @@
           <w:i w:val="0"/>
           <w:sz w:val="22"/>
         </w:rPr>
-        <w:t>We test the framework in three pre-registered settings. First, at the cancer-type level, does ε* predict published resistance half-lives across diverse malignancies? Second, among patients receiving BRAF inhibition with resistance-annotated follow-up, does log(N_e/N_e*) at baseline sequencing predict duration on therapy? Third, in contemporary sequencing cohorts, what fraction of patients exceed N_e* at diagnosis, and can the required inputs be read from standard reports? We report pre-registered generic progression-free survival (PFS) analyses as a negative control where endpoints do not specifically mark evolutionary resistance. We do not experimentally manipulate N_e; causal tests in barcoded model systems remain separate future work.</w:t>
+        <w:t>We test three pre-registered predictions. First, ε* should track published resistance half-lives across cancer types. Second, among vemurafenib-treated melanoma patients with resistance-annotated follow-up, log(N_e/N_e*) at baseline should predict duration on drug. Third, N_e* should be computable from standard sequencing reports, with a measurable fraction of patients above threshold at diagnosis. Generic TCGA progression-free survival (PFS) serves as a pre-specified negative control when endpoints do not mark evolutionary resistance. We do not experimentally manipulate N_e; causal tests in barcoded model systems are deferred.</w:t>
       </w:r>
     </w:p>
     <w:p>
@@ -276,7 +276,7 @@
           <w:i w:val="0"/>
           <w:sz w:val="22"/>
         </w:rPr>
-        <w:t>N_e* is defined as the smallest effective population size for which the PAC failure probability is at most δ = 0.05 at accuracy ε = 0.05, given patient-specific V_A and cancer-type L (Methods; Supplementary Note 1). In practice, V_A is estimated from the dispersion of mutation VAFs (MATH-score calibration), N_e from the subclonal VAF site-frequency spectrum (Williams et al. scaling), and L from a fixed panel of resistance-relevant loci per indication (Extended Data Table 1). All three quantities are routinely inferable before therapy from a single baseline sequencing sample when purity is available or estimable.</w:t>
+        <w:t>N_e* is the smallest effective population size for which the PAC failure probability does not exceed δ = 0.05 at accuracy ε = 0.05, given patient V_A and cancer-type L (Methods; Supplementary Note 1). V_A is estimated from VAF dispersion (MATH-score calibration), N_e from the subclonal VAF site-frequency spectrum (Williams et al. scaling), and L from a fixed resistance-locus panel per indication (Extended Data Table 1). Each quantity is inferable from a single pre-treatment sample when tumour purity is known or estimable.</w:t>
       </w:r>
     </w:p>
     <w:p>
@@ -290,7 +290,7 @@
           <w:i w:val="0"/>
           <w:sz w:val="22"/>
         </w:rPr>
-        <w:t>Figure 1 illustrates the clinical mapping. Panel a shows a representative melanoma report with heterogeneity metrics, effective population size, and driver-panel size highlighted. Panel b computes N_e* = 9,262 cells for an example with V_A = 0.14, N_e = 8,200, and L = 10, yielding N_e/N_e* = 0.89 and a below-threshold call. The workflow requires no proprietary scores beyond locked constants ε and δ; outputs can be appended as an interpretive line on existing molecular pathology reports.</w:t>
+        <w:t>Figure 1 maps the computation onto a representative melanoma report. Panel a highlights heterogeneity, effective population size, and driver-panel size—the three inputs already present on most molecular pathology summaries. Panel b computes N_e* = 9,262 cells for V_A = 0.14, N_e = 8,200, and L = 10, giving N_e/N_e* = 0.89 and a below-threshold call in the PAC sense. No proprietary assay is required; the output can be appended as an interpretive line on existing reports.</w:t>
       </w:r>
     </w:p>
     <w:p/>
@@ -350,7 +350,7 @@
           <w:i/>
           <w:sz w:val="20"/>
         </w:rPr>
-        <w:t>Resistance-learnability threshold mapped to clinical sequencing. a, Mock tumour profiling summary with inputs V_A, N_e, and L indicated (dashed boxes). b, Computed N_e*, ε*, and patient ratio for representative melanoma (N_e/N_e* = 0.89; below threshold).</w:t>
+        <w:t>Resistance-learnability threshold mapped to clinical sequencing. a, Mock tumour profiling summary with inputs V_A, N_e, and L (dashed boxes). b, Computed N_e*, ε*, and patient ratio (N_e/N_e* = 0.89; below threshold).</w:t>
       </w:r>
     </w:p>
     <w:p>
@@ -375,7 +375,7 @@
           <w:i w:val="0"/>
           <w:sz w:val="22"/>
         </w:rPr>
-        <w:t>We assembled independent ecological parameters for seventeen solid and haematologic malignancies: published median N_e and V_A (Williams et al. 2016; Dentro et al. 2021), curated L from config/driver_loci_L.tsv, and literature resistance half-life TTR₂ (Extended Data Table 2). The outcome was resistance instability 1/TTR₂ (months⁻¹); larger values indicate faster resistance emergence on standard-of-care systemic therapy for that disease context.</w:t>
+        <w:t>We compiled independent ecological parameters for seventeen malignancies: published median N_e and V_A (Williams et al. 2016; Dentro et al. 2021), curated L, and literature resistance half-life TTR₂ (Extended Data Table 2). The outcome was resistance instability 1/TTR₂ (months⁻¹), with larger values indicating faster resistance on standard systemic therapy in each disease context.</w:t>
       </w:r>
     </w:p>
     <w:p>
@@ -389,7 +389,7 @@
           <w:i w:val="0"/>
           <w:sz w:val="22"/>
         </w:rPr>
-        <w:t>ε* correlated strongly with 1/TTR₂ (Pearson r = 0.88, P = 3.1 × 10⁻⁶; Fig. 2). Fast-resistance leukaemias and glioblastoma occupied the upper envelope (AML, 1/TTR₂ ≈ 0.33 months⁻¹; GBM, 0.25), whereas thyroid cancer and renal cell carcinoma lay at the lower extreme (THCA, 0.02; KIRC, 0.067). Association was robust to leave-one-out deletion (mean r = 0.88; minimum r = 0.77 when any single type was removed) and to bootstrap resampling of cancer types (10,000 replicates; 95% confidence interval for r: 0.51–0.96). Doubling or halving L changed r by less than 0.002 (Extended Data Table 3), indicating that the result is not an artefact of a particular panel size.</w:t>
+        <w:t>ε* correlated strongly with 1/TTR₂ (Pearson r = 0.88, P = 3.1 × 10⁻⁶; Fig. 2). Acute myeloid leukaemia and glioblastoma occupied the fast-resistance extreme (1/TTR₂ ≈ 0.33 and 0.25 months⁻¹, respectively); thyroid carcinoma and renal cell carcinoma lay at the slow extreme (0.02 and 0.067). Leave-one-out deletion left the association intact (mean r = 0.88; minimum r = 0.77). Bootstrap resampling of cancer types (10,000 replicates) gave a 95% confidence interval for r of 0.51–0.96, reflecting uncertainty from the modest number of types rather than fragility of the estimate. Halving or doubling L changed r by at most 0.002 (Extended Data Table 3).</w:t>
       </w:r>
     </w:p>
     <w:p>
@@ -403,7 +403,7 @@
           <w:i w:val="0"/>
           <w:sz w:val="22"/>
         </w:rPr>
-        <w:t>This analysis was specified before patient-level outcome inspection and provides the primary empirical support for the framework: a purely sequence-derived evolutionary quantity tracks cross-cancer resistance ecology without fitting to individual patient progression times.</w:t>
+        <w:t>Specified before inspection of patient outcomes, this analysis is the primary empirical support for the framework: a sequence-derived evolutionary quantity tracks cross-cancer resistance ecology without regression to individual progression times.</w:t>
       </w:r>
     </w:p>
     <w:p/>
@@ -463,7 +463,7 @@
           <w:i/>
           <w:sz w:val="20"/>
         </w:rPr>
-        <w:t>Cross-cancer validation of ε* versus resistance instability. Each point is one cancer type (n = 17). x, PAC bound ε*(N_e, V_A, L); y, published 1/TTR₂ (months⁻¹). Dashed line, ordinary least-squares fit. Pearson r = 0.88 (P = 3.1 × 10⁻⁶); LOO minimum r = 0.77.</w:t>
+        <w:t>Cross-cancer validation of ε* versus resistance instability (n = 17 types). x-axis, PAC bound ε*(N_e, V_A, L); y-axis, published 1/TTR₂ (months⁻¹). Dashed line, OLS fit. Pearson r = 0.88 (P = 3.1 × 10⁻⁶); LOO minimum r = 0.77.</w:t>
       </w:r>
     </w:p>
     <w:p>
@@ -488,7 +488,7 @@
           <w:i w:val="0"/>
           <w:sz w:val="22"/>
         </w:rPr>
-        <w:t>Patient-level validation used the Broad/Dana-Farber vemurafenib resistance study (skcm_broad_brafresist_2012), the largest public cohort with baseline exome sequencing and resistance-focused follow-up (Van Allen et al. 2014). Of 46 enrolled patients, 45 had usable VAF profiles and annotated duration on vemurafenib; events comprised early resistance or best response progressive disease (n = 14 events).</w:t>
+        <w:t>Patient-level validation used the Broad/Dana-Farber vemurafenib cohort (skcm_broad_brafresist_2012; Van Allen et al. 2014)—the largest public dataset with baseline exome sequencing and resistance-focused follow-up. Forty-five of forty-six patients had usable VAF profiles and duration on vemurafenib; the pre-registered event combined early resistance annotation or best response progressive disease (fourteen events).</w:t>
       </w:r>
     </w:p>
     <w:p>
@@ -502,7 +502,7 @@
           <w:i w:val="0"/>
           <w:sz w:val="22"/>
         </w:rPr>
-        <w:t>Effective N_e was cohort-calibrated to Williams melanoma anchors so median N_e matches published scale while preserving within-cohort rank order (Methods; OSF deviation note). The pre-registered primary model was Cox proportional hazards with log₁₀(N_e/N_e*) as a continuous covariate. The hazard ratio was 0.97 (95% CI 0.20–4.71; P = 0.97; Fig. 3). Spearman correlation between log₁₀(N_e/N_e*) and months on therapy was ρ = −0.025 (P = 0.87). Logistic regression of early resistance on log₁₀(N_e/N_e*) gave odds ratio 0.84 per log₁₀ unit (P = 0.86). After calibration, 44 of 45 patients had N_e &lt; N_e*, leaving a single patient above threshold and preventing stable binary Kaplan–Meier comparison.</w:t>
+        <w:t>Patient N_e was cohort-calibrated to Williams melanoma anchors, preserving rank order within the study (Methods; OSF deviation note). The pre-registered primary model was Cox regression with log₁₀(N_e/N_e*) as a continuous covariate. Hazard ratio 0.97 (95% CI 0.20–4.71; P = 0.97; Fig. 3). Spearman ρ between log₁₀(N_e/N_e*) and months on therapy was −0.025 (P = 0.87). Logistic regression of early resistance on log₁₀(N_e/N_e*) gave odds ratio 0.84 per log₁₀ unit (P = 0.86). Forty-four of forty-five patients had N_e &lt; N_e*, leaving one above threshold and precluding stable binary Kaplan–Meier comparison.</w:t>
       </w:r>
     </w:p>
     <w:p>
@@ -516,7 +516,7 @@
           <w:i w:val="0"/>
           <w:sz w:val="22"/>
         </w:rPr>
-        <w:t>We attempted to enlarge the panel with MSK-IMPACT and MSK-Archer BRAF-mutant cohorts (n ≈ 210 combined). Neither study exposes duration-on-therapy or resistance-date fields in public cBioPortal metadata, so they could not be merged under pre-registered endpoints. We therefore interpret the Broad result as an honest null under severe power constraints, not as definitive evidence against patient-level utility.</w:t>
+        <w:t>We sought to expand the panel with MSK-IMPACT and MSK-Archer BRAF-mutant cohorts (≈210 patients combined). Neither exposes duration-on-therapy or resistance-date fields in public cBioPortal metadata, so they could not be merged under pre-registered endpoints. We report the Broad result as a pre-specified null under severe power constraints—not as evidence against patient-level utility in better-annotated cohorts.</w:t>
       </w:r>
     </w:p>
     <w:p/>
@@ -576,7 +576,7 @@
           <w:i/>
           <w:sz w:val="20"/>
         </w:rPr>
-        <w:t>Targeted BRAF inhibitor cohort (Broad 2012; n = 45). a, Duration on vemurafenib versus log₁₀(N_e/N_e*); blue, no early resistance; red, early resistance. b, Duration by early-resistance phenotype (box plots). Cox HR = 0.97 (P = 0.97); Spearman ρ = −0.025.</w:t>
+        <w:t>Targeted BRAF inhibitor cohort (Broad 2012; n = 45). a, Duration on vemurafenib versus log₁₀(N_e/N_e*); blue, no early resistance; red, early resistance. b, Duration by early-resistance phenotype. Cox HR = 0.97 (P = 0.97).</w:t>
       </w:r>
     </w:p>
     <w:p>
@@ -587,7 +587,7 @@
         <w:rPr>
           <w:rFonts w:ascii="Times New Roman" w:hAnsi="Times New Roman"/>
         </w:rPr>
-        <w:t>Deployability and population-level context</w:t>
+        <w:t>Population distribution and clinical deployability</w:t>
       </w:r>
     </w:p>
     <w:p>
@@ -601,7 +601,7 @@
           <w:i w:val="0"/>
           <w:sz w:val="22"/>
         </w:rPr>
-        <w:t>To assess whether N_e* can be computed in contemporary practice, we applied the pipeline to 1,564 patients across four cBioPortal cohorts with baseline mutation data: TCGA colorectal (n = 528), cutaneous melanoma (n = 433), LUAD (n = 557), and BRAF-inhibitor melanoma (n = 46; Fig. 4).</w:t>
+        <w:t>We applied the pipeline to 1,564 patients in four cBioPortal cohorts with baseline mutation data: TCGA colorectal (n = 528), cutaneous melanoma (n = 433), LUAD (n = 557), and BRAF-inhibitor melanoma (n = 46; Fig. 4). Every patient passed genomic quality filters and yielded finite V_A and N_e.</w:t>
       </w:r>
     </w:p>
     <w:p>
@@ -615,7 +615,7 @@
           <w:i w:val="0"/>
           <w:sz w:val="22"/>
         </w:rPr>
-        <w:t>Median N_e/N_e* varied by disease context: colorectal 0.48 (20% of patients ≥ N_e*), melanoma 0.56 (28%), LUAD 0.24 (2%), and BRAF-treated melanoma 0.18 (2%). The pooled distribution was skewed below unity on a log scale, with a tail above N_e* in colorectal and cutaneous melanoma—settings with higher V_A and L that raise the learnability bar. These patterns imply that binary above/below reporting will often label a minority of patients in any given clinic, favouring continuous log(N_e/N_e*) where sample size allows.</w:t>
+        <w:t>Median N_e/N_e* varied by context: colorectal 0.48 (20% ≥ N_e*), melanoma 0.56 (28%), LUAD 0.24 (2%), BRAF-treated melanoma 0.18 (2%). The pooled distribution skewed below unity on a log scale, with an upper tail in colorectal and cutaneous melanoma—settings where higher V_A and L raise the learnability bar. Binary above/below reporting will therefore label a minority in many clinics; continuous log(N_e/N_e*) is the appropriate default for statistical modelling.</w:t>
       </w:r>
     </w:p>
     <w:p/>
@@ -675,7 +675,7 @@
           <w:i/>
           <w:sz w:val="20"/>
         </w:rPr>
-        <w:t>Clinical utility at baseline sequencing (n = 1,564). a, Pooled histogram of log₁₀(N_e/N_e*); dashed line, N_e = N_e*. b, Percentage of patients with N_e ≥ N_e* by cohort.</w:t>
+        <w:t>Clinical utility at baseline sequencing (n = 1,564). a, Pooled histogram of log₁₀(N_e/N_e*); dashed line, N_e = N_e*. b, Percentage with N_e ≥ N_e* by cohort.</w:t>
       </w:r>
     </w:p>
     <w:p>
@@ -686,7 +686,7 @@
         <w:rPr>
           <w:rFonts w:ascii="Times New Roman" w:hAnsi="Times New Roman"/>
         </w:rPr>
-        <w:t>Pre-registered TCGA progression-free survival (negative control)</w:t>
+        <w:t>Pre-registered TCGA PFS as negative control</w:t>
       </w:r>
     </w:p>
     <w:p>
@@ -700,7 +700,7 @@
           <w:i w:val="0"/>
           <w:sz w:val="22"/>
         </w:rPr>
-        <w:t>As pre-registered, we tested N_e* stratification on generic PFS in TCGA LUAD, SKCM, and COADREAD (pooled n = 1,440 after quality filters). Calibration reduced the fraction above N_e* from more than 90% on uncorrected raw N_e to 16%, improving stratum balance (233 above, 1,207 below). Kaplan–Meier log-rank tests were null overall (P = 0.55) and within each tumour type (COADREAD P = 0.31; LUAD P = 0.86; SKCM P = 0.52; Extended Data Fig. 1).</w:t>
+        <w:t>Pre-registered binary stratification on generic PFS in TCGA LUAD, SKCM, and COADREAD yielded pooled n = 1,440 after quality filters. Calibration reduced the fraction above N_e* from &gt;90% on uncorrected N_e to 16.2% (233 above, 1,207 below). Kaplan–Meier log-rank tests were null overall (P = 0.55) and within each type (COADREAD P = 0.31; LUAD P = 0.86; SKCM P = 0.52; Extended Data Fig. 1; Extended Data Table 4).</w:t>
       </w:r>
     </w:p>
     <w:p>
@@ -714,7 +714,7 @@
           <w:i w:val="0"/>
           <w:sz w:val="22"/>
         </w:rPr>
-        <w:t>A pre-specified continuous Cox model on log₁₀(N_e/N_e*) reached P = 0.04 in the pooled sample (HR = 0.82), but the direction was opposite to the resistance-learnability hypothesis (higher ratio associated with longer PFS). We attribute this to endpoint confounding: TCGA PFS mixes adjuvant and metastatic courses, non-targeted regimens, and progression that may reflect bulk growth rather than evolutionary escape. We report this transparently as a negative control rather than as supportive evidence.</w:t>
+        <w:t>Continuous Cox regression on log₁₀(N_e/N_e*) in the pooled sample reached P = 0.042 (HR = 0.82)—significant but opposite to the pre-registered direction (higher ratio associated with longer PFS). TCGA PFS conflates adjuvant and metastatic disease, mixed regimens, and progression that need not reflect evolutionary escape. We treat this as a negative control illustrating endpoint mismatch, not as supportive or refuting evidence.</w:t>
       </w:r>
     </w:p>
     <w:p/>
@@ -774,7 +774,7 @@
           <w:i/>
           <w:sz w:val="20"/>
         </w:rPr>
-        <w:t>Pre-registered TCGA PFS by N_e* stratum (calibrated N_e; pooled n = 1,440). Red, N_e ≥ N_e* (n = 233); blue, N_e &lt; N_e* (n = 1,207). Log-rank P = 0.55.</w:t>
+        <w:t>Pre-registered TCGA PFS by N_e* stratum (n = 1,440). Red, N_e ≥ N_e* (n = 233); blue, N_e &lt; N_e* (n = 1,207). Log-rank P = 0.55.</w:t>
       </w:r>
     </w:p>
     <w:p>
@@ -799,7 +799,7 @@
           <w:i w:val="0"/>
           <w:sz w:val="22"/>
         </w:rPr>
-        <w:t>This study translates an evolutionary sample-complexity bound into a clinically readable threshold, N_e*, and tests it at three scales: pan-cancer ecology, targeted-therapy patients, and population deployability. The central finding is that ε*(N_e, V_A, L)—computed without reference to individual outcomes—tracks how fast resistance emerges across seventeen cancer types (r = 0.88). That association survives leave-one-out stress tests and wide variation in driver-panel size, addressing concerns that the framework merely repackages known heterogeneity indices.</w:t>
+        <w:t>We translate an evolutionary sample-complexity bound into N_e*, a threshold readable on standard sequencing reports, and test it at three scales. The principal finding is ecological: ε*(N_e, V_A, L), computed without reference to patient outcomes, tracks how quickly resistance emerges across seventeen cancer types (r = 0.88). That result survives leave-one-out deletion and wide perturbation of L, and does not reduce to repackaging existing heterogeneity indices because L is fixed independently of N_e.</w:t>
       </w:r>
     </w:p>
     <w:p>
@@ -813,7 +813,7 @@
           <w:i w:val="0"/>
           <w:sz w:val="22"/>
         </w:rPr>
-        <w:t>Patient-level validation on public data did not confirm faster failure with higher log(N_e/N_e*) in BRAF-mutant melanoma. Interpreting this null requires context. The Broad cohort offers the cleanest resistance annotations in open data but includes only fourteen events and, after principled N_e calibration, places ninety-eight percent of patients below N_e*. MSK BRAF series are larger but lack resistance-dated fields in cBioPortal, illustrating a broader bottleneck: most genomic archives were built for genotype–outcome association, not for time-to-resistance on targeted agents. Prospective registries that record molecular progression dates—and serial ctDNA where available—are the necessary next step.</w:t>
+        <w:t>The title’s claim—that resistance cannot evolve below N_e*—is intended in the PAC sense of reliable learnability under bounded error, not as a guarantee that no resistant clone will ever appear. Empirically, patient-level and PFS tests on public data neither confirm nor refute that stronger reading; they were underpowered or used mismatched endpoints. The Broad vemurafenib cohort (fourteen events; 98% below N_e* after calibration) cannot discriminate subtle hazard differences. Larger MSK BRAF series exist but lack resistance dates in open metadata—a systematic gap in genomic archives built for genotype–survival association rather than time-to-resistance on targeted agents.</w:t>
       </w:r>
     </w:p>
     <w:p>
@@ -827,7 +827,7 @@
           <w:i w:val="0"/>
           <w:sz w:val="22"/>
         </w:rPr>
-        <w:t>Deployability is nonetheless immediate in a limited sense. N_e* can be computed from fields already on sequencing reports, and our distribution analyses show that the threshold is not trivially exceeded for every patient: the above-threshold fraction ranged from 2% in LUAD and BRAF-treated melanoma to 28% in TCGA melanoma. Clinicians could receive a continuous log(N_e/N_e*) readout alongside TMB and driver calls, analogous to how MATH and related scores summarise heterogeneity—while acknowledging that cut-offs will be indication-specific and should not drive treatment algorithms without prospective outcome evidence.</w:t>
+        <w:t>Deployability is more immediate. All inputs for N_e* are already reported or derivable on most panels, and only 2–28% of patients exceeded the threshold in our distribution analysis, depending on indication. A continuous log(N_e/N_e*) line item—alongside TMB and driver calls—could frame evolutionary risk without implying that a binary cut should alter treatment until prospective outcome evidence exists.</w:t>
       </w:r>
     </w:p>
     <w:p>
@@ -841,7 +841,7 @@
           <w:i w:val="0"/>
           <w:sz w:val="22"/>
         </w:rPr>
-        <w:t>Pre-registered TCGA PFS analyses clarify what N_e* is not. Generic PFS is a poor proxy for evolutionary resistance; the null binary result (P = 0.55) is consistent with endpoint mismatch rather than biological refutation. The statistically significant but inverted continuous Cox estimate (HR = 0.82, P = 0.04) further cautions against fishing in all-comer survival endpoints.</w:t>
+        <w:t>Pre-registered TCGA PFS analyses delimit what not to claim. Generic PFS is a poor proxy for resistance evolution; the null binary result (P = 0.55) is exactly what endpoint mismatch predicts. The significant inverted continuous Cox estimate (HR = 0.82, P = 0.042) warns against exploratory survival mining without resistance-specific labels.</w:t>
       </w:r>
     </w:p>
     <w:p>
@@ -855,7 +855,7 @@
           <w:i w:val="0"/>
           <w:sz w:val="22"/>
         </w:rPr>
-        <w:t>Limitations include retrospective design, VAF-based N_e estimation error, post hoc calibration of N_e to Williams medians (documented on OSF), and literature-derived TTR₂ values for cross-cancer comparisons. The PAC derivation assumes a simplified fitness landscape; Supplementary Note 1 provides full theory, but the main text stands on empirics. Causal manipulation of N_e in barcoded cell systems—holding genetics constant while varying effective population size—remains the definitive experimental test and was outside scope here.</w:t>
+        <w:t>Limitations include retrospective design, error in VAF-based N_e estimation, post hoc calibration of N_e to Williams medians (documented on OSF), and literature-derived TTR₂ for cross-cancer comparisons. The PAC landscape is simplified; full derivations appear in Supplementary Note 1. Definitive causal proof requires experimental control of effective population size—outside the scope of this observational study.</w:t>
       </w:r>
     </w:p>
     <w:p>
@@ -869,7 +869,7 @@
           <w:i w:val="0"/>
           <w:sz w:val="22"/>
         </w:rPr>
-        <w:t>In summary, N_e* names a resistance-learnability limit computable at diagnosis. Cross-cancer ecology supports the quantity; patient-level and PFS tests on available public data do not. The honest package—a strong pan-cancer pattern, transparent nulls, and a clear deployment path—defines what can be claimed today and what must be proved tomorrow.</w:t>
+        <w:t>N_e* names a computable resistance-learnability limit at diagnosis. Cross-cancer ecology supports it; available patient-level tests do not. Presenting both—with a clear deployment path and transparent nulls—states honestly what sequencing can say about evolutionary risk today.</w:t>
       </w:r>
     </w:p>
     <w:p>
@@ -905,7 +905,7 @@
           <w:i w:val="0"/>
           <w:sz w:val="22"/>
         </w:rPr>
-        <w:t>Analyses were pre-registered on the Open Science Framework (https://osf.io/kp5jf) on 19 June 2026. Fixed constants ε = 0.05, δ = 0.05, the driver-locus table L, primary cohort identifiers, estimators, and endpoint definitions were locked before inspection of patient-level results for the reframed submission. A post hoc deviation note documents cohort-wise calibration of patient N_e to Williams/Dentro median anchors; ε, δ, L, and cohort lists were unchanged.</w:t>
+        <w:t>Hypotheses, estimators, constants (ε = 0.05, δ = 0.05), driver-locus table L, cohort identifiers, and endpoint definitions were registered on the Open Science Framework (https://osf.io/kp5jf) on 19 June 2026 before inspection of patient-level results for this reframed analysis. A documented deviation added cohort-wise calibration of patient N_e to Williams/Dentro median anchors; ε, δ, L, and cohort lists were unchanged.</w:t>
       </w:r>
     </w:p>
     <w:p>
@@ -930,7 +930,7 @@
           <w:i w:val="0"/>
           <w:sz w:val="22"/>
         </w:rPr>
-        <w:t>The evolutionary PAC bound is ε*(N_e, V_A, L) = √(2 V_A [L ln(e N_e/L) + ln(4/δ)] / N_e). N_e* is the minimum N_e such that the PAC failure probability P(failure) ≤ δ at tolerance ε, obtained by bisection on the monotone tail (implementation: src/threshold.py). Patient classification uses baseline sequencing before systemic therapy. The ratio N_e/N_e* is reported on log₁₀ scale for regression models.</w:t>
+        <w:t>The bound ε*(N_e, V_A, L) = √(2 V_A [L ln(e N_e/L) + ln(4/δ)] / N_e). N_e* solves P(failure) ≤ δ at tolerance ε by bisection on the monotone PAC tail. Classification uses baseline sequencing before systemic therapy. Regression models employ log₁₀(N_e/N_e*).</w:t>
       </w:r>
     </w:p>
     <w:p>
@@ -955,7 +955,7 @@
           <w:i w:val="0"/>
           <w:sz w:val="22"/>
         </w:rPr>
-        <w:t>V_A: MATH score 100 × MAD(VAF)/median(VAF) from somatic SNV VAFs, scaled to PCAWG variance units (divide by 180). N_e: subclonal VAF spectrum estimator requiring ≥5 mutations with 0.05 ≤ VAF ≤ 0.5; cohort-calibrated so median N_e matches config/williams_Ne_reference.tsv per cancer type while preserving rank order within cohort. L: integer count from config/driver_loci_L.tsv (OncoKB/CIViC actionable panels, 2024 snapshot); never log₂(N_e). h² proxy (subclonal mutation fraction) is reported in figures but not used in N_e* inversion. Quality gates: ≥3 mutations; finite V_A and N_e.</w:t>
+        <w:t>V_A: MATH score (100 × MAD(VAF)/median(VAF)) scaled to PCAWG variance units (/180). N_e: subclonal VAF spectrum estimator (≥5 mutations with 0.05 ≤ VAF ≤ 0.5), cohort-calibrated to published median N_e per cancer type while preserving within-cohort rank order. L: integer resistance-locus count from a fixed OncoKB/CIViC panel snapshot (June 2024); never log₂(N_e). Subclonal mutation fraction (h² proxy) appears in Fig. 1 for clinical context but does not enter N_e* inversion. Quality gates: ≥3 mutations; finite V_A and N_e.</w:t>
       </w:r>
     </w:p>
     <w:p>
@@ -980,7 +980,7 @@
           <w:i w:val="0"/>
           <w:sz w:val="22"/>
         </w:rPr>
-        <w:t>Seventeen cancer types with published median N_e, V_A, independently assigned L, and TTR₂ from primary literature (AML: Shlush et al.; GBM: Omuro et al.; SKCM/BRAF: Wagle et al.; NSCLC-EGFR: Oxnard et al.; NSCLC-ICB: Hellmann et al.; PRAD-met: Scher et al.; THCA: Haugen et al.; remaining solid tumours: TCGA median or disease-specific reviews; full table in data/fig2_cross_cancer/cross_cancer_table.csv). Outcome: 1/TTR₂. Statistics: Pearson correlation; leave-one-out correlation; 10,000 bootstrap replicates resampling types with replacement; L sensitivity at 0.5×, 1.0×, 2.0× multipliers.</w:t>
+        <w:t>Seventeen cancer types with published median N_e, V_A, independently assigned L, and TTR₂ (sources in Supplementary Table 1 and repository file cross_cancer_table.csv). Outcome: 1/TTR₂. Statistics: Pearson r; leave-one-out r; 10,000 bootstrap replicates resampling types; L sensitivity at 0.5×, 1.0×, 2.0×.</w:t>
       </w:r>
     </w:p>
     <w:p>
@@ -1005,7 +1005,7 @@
           <w:i w:val="0"/>
           <w:sz w:val="22"/>
         </w:rPr>
-        <w:t>Mutation and clinical data were retrieved via the cBioPortal public REST API (June 2026). Targeted therapy: skcm_broad_brafresist_2012 — duration on vemurafenib (weeks converted to months × 12/52); event if EARLY_RESISTANCE = Yes or TREATMENT_BEST_RESPONSE = PD. Utility cohorts: luad_tcga_pan_can_atlas_2018, skcm_tcga_pan_can_atlas_2018, coadread_tcga_pan_can_atlas_2018, skcm_broad_brafresist_2012. Negative control: pooled TCGA PFS (PFS_MONTHS; event if PFS_STATUS indicates progression). Mutation VAFs cached locally under data/cache/.</w:t>
+        <w:t>Mutation and clinical data were retrieved from the cBioPortal REST API (June 2026). Targeted therapy: skcm_broad_brafresist_2012 — duration on vemurafenib (weeks × 12/52 = months); event if early resistance or best response PD. Utility: TCGA LUAD, SKCM, COADREAD, and the Broad BRAF cohort. Negative control: pooled TCGA PFS (progression on PFS_STATUS). VAF data are downloaded on first pipeline run and cached locally.</w:t>
       </w:r>
     </w:p>
     <w:p>
@@ -1030,7 +1030,7 @@
           <w:i w:val="0"/>
           <w:sz w:val="22"/>
         </w:rPr>
-        <w:t>Cox proportional hazards (lifelines v0.27) for continuous log₁₀(N_e/N_e*); Kaplan–Meier and log-rank for binary N_e ≥ N_e* when ≥3 patients per arm; logistic regression for early resistance. Two-sided α = 0.05. No multiplicity adjustment across secondary endpoints; pre-registered primary tests are reported verbatim.</w:t>
+        <w:t>Cox proportional hazards (lifelines 0.27) for continuous log₁₀(N_e/N_e*); Kaplan–Meier and log-rank for binary N_e ≥ N_e* when ≥3 patients per arm; logistic regression for early resistance. Two-sided α = 0.05. Pre-registered primary tests are reported without multiplicity adjustment; secondary and negative-control analyses are labelled explicitly.</w:t>
       </w:r>
     </w:p>
     <w:p>
@@ -1055,7 +1055,7 @@
           <w:i w:val="0"/>
           <w:sz w:val="22"/>
         </w:rPr>
-        <w:t>Analysis code, locked configuration, and figure scripts are available at https://github.com/rstil2/computable-resistance-threshold and in the Project 51 working directory. A Zenodo archive linked to the GitHub release will be published at acceptance.</w:t>
+        <w:t>Analysis code, locked configuration, and figure scripts: https://github.com/rstil2/computable-resistance-threshold. Regenerate all outputs: python scripts/run_nat_cancer_figures.py. A Zenodo archive linked to the GitHub release will be minted at acceptance.</w:t>
       </w:r>
     </w:p>
     <w:p>
@@ -1105,7 +1105,7 @@
           <w:i w:val="0"/>
           <w:sz w:val="22"/>
         </w:rPr>
-        <w:t>V_A — subclonal diversity (MATH-calibrated CCF variance proxy). N_e — effective population size (VAF spectrum estimator, Williams-calibrated). L — resistance-relevant driver loci (independent panel per cancer type). ε, δ — fixed at 0.05 (locked pre-registration).</w:t>
+        <w:t>V_A — subclonal diversity (MATH-calibrated variance proxy). N_e — effective population size (VAF spectrum, Williams-calibrated). L — resistance-relevant driver loci (independent panel). ε, δ — 0.05 (pre-registered).</w:t>
       </w:r>
     </w:p>
     <w:p>
@@ -1130,7 +1130,7 @@
           <w:i/>
           <w:sz w:val="22"/>
         </w:rPr>
-        <w:t>Cross-cancer ecological parameters (n = 17 types)</w:t>
+        <w:t>Cross-cancer ecological parameters (n = 17)</w:t>
       </w:r>
     </w:p>
     <w:p>
@@ -1144,7 +1144,7 @@
           <w:i w:val="0"/>
           <w:sz w:val="22"/>
         </w:rPr>
-        <w:t>Full numeric values in data/fig2_cross_cancer/cross_cancer_table.csv: columns Ne, VA, L, ε*, TTR₂, 1/TTR₂ with literature sources per row.</w:t>
+        <w:t>Full Ne, V_A, L, ε*, TTR₂, and 1/TTR₂ with literature sources — see Supplementary Table 1 and cross_cancer_table.csv in the code repository.</w:t>
       </w:r>
     </w:p>
     <w:p>
@@ -1169,7 +1169,7 @@
           <w:i/>
           <w:sz w:val="22"/>
         </w:rPr>
-        <w:t>Sensitivity of cross-cancer correlation to L panel size</w:t>
+        <w:t>Sensitivity of cross-cancer correlation to L</w:t>
       </w:r>
     </w:p>
     <w:p>
@@ -1183,7 +1183,7 @@
           <w:i w:val="0"/>
           <w:sz w:val="22"/>
         </w:rPr>
-        <w:t>L multiplier 0.5: Pearson r = 0.879 (P = 3.5 × 10⁻⁶). L multiplier 1.0: r = 0.881 (P = 3.1 × 10⁻⁶). L multiplier 2.0: r = 0.880 (P = 3.3 × 10⁻⁶).</w:t>
+        <w:t>L × 0.5: r = 0.879 (P = 3.5 × 10⁻⁶). L × 1.0: r = 0.881 (P = 3.1 × 10⁻⁶). L × 2.0: r = 0.880 (P = 3.3 × 10⁻⁶).</w:t>
       </w:r>
     </w:p>
     <w:p>
@@ -1208,7 +1208,7 @@
           <w:i/>
           <w:sz w:val="22"/>
         </w:rPr>
-        <w:t>Pre-registered TCGA PFS summary (calibrated N_e)</w:t>
+        <w:t>Pre-registered TCGA PFS (calibrated N_e)</w:t>
       </w:r>
     </w:p>
     <w:p>
@@ -1222,7 +1222,7 @@
           <w:i w:val="0"/>
           <w:sz w:val="22"/>
         </w:rPr>
-        <w:t>COADREAD (n = 524): 19.8% above N_e*; log-rank P = 0.31; Cox HR = 0.77 (P = 0.26). LUAD (n = 497): 1.8% above; log-rank P = 0.86; Cox HR = 0.71 (P = 0.17). SKCM (n = 419): 28.6% above; log-rank P = 0.52; Cox HR = 0.89 (P = 0.40). Pooled (n = 1,440): 16.2% above; log-rank P = 0.55; Cox HR = 0.82 (P = 0.042).</w:t>
+        <w:t>COADREAD (n = 524): 19.8% above N_e*; log-rank P = 0.31; Cox HR = 0.77 (P = 0.26). LUAD (n = 497): 1.8%; log-rank P = 0.86; HR = 0.71 (P = 0.17). SKCM (n = 419): 28.6%; log-rank P = 0.52; HR = 0.89 (P = 0.40). Pooled (n = 1,440): 16.2%; log-rank P = 0.55; HR = 0.82 (P = 0.042).</w:t>
       </w:r>
     </w:p>
     <w:p>
@@ -1247,7 +1247,7 @@
           <w:i w:val="0"/>
           <w:sz w:val="22"/>
         </w:rPr>
-        <w:t>Patient-level mutation and clinical data are available through cBioPortal (https://www.cbioportal.org) under the study accession IDs listed in config/cohorts.yaml. Processed summary tables and figure statistics are in data/fig*/. Analysis code and locked parameters: https://github.com/rstil2/computable-resistance-threshold. Pre-registration: https://osf.io/kp5jf.</w:t>
+        <w:t>Patient-level data are available through cBioPortal (https://www.cbioportal.org) under study accessions listed in the repository cohort manifest. Processed figure statistics and patient summary tables accompany the code release at https://github.com/rstil2/computable-resistance-threshold. Pre-registration: https://osf.io/kp5jf.</w:t>
       </w:r>
     </w:p>
     <w:p>
@@ -1297,7 +1297,7 @@
           <w:i w:val="0"/>
           <w:sz w:val="22"/>
         </w:rPr>
-        <w:t>This study uses de-identified public retrospective data only; no new human participants were recruited. Original study ethics approvals are described in the primary publications for each cBioPortal cohort.</w:t>
+        <w:t>De-identified retrospective public data only; no new human participants. Ethics approvals for original cohorts are described in their primary publications.</w:t>
       </w:r>
     </w:p>
     <w:p>
@@ -1322,7 +1322,7 @@
           <w:i w:val="0"/>
           <w:sz w:val="22"/>
         </w:rPr>
-        <w:t>We thank the cBioPortal and TCGA communities for open access to genomic and clinical data.</w:t>
+        <w:t>The author thanks the cBioPortal and TCGA communities for open genomic and clinical data.</w:t>
       </w:r>
     </w:p>
     <w:p>
@@ -1347,7 +1347,7 @@
           <w:i w:val="0"/>
           <w:sz w:val="22"/>
         </w:rPr>
-        <w:t>R.C.S. conceived the study, developed the theory, performed all analyses, generated the figures, and wrote the manuscript.</w:t>
+        <w:t>R.C.S. conceived the study, developed the theory, performed all analyses, generated figures, and wrote the manuscript.</w:t>
       </w:r>
     </w:p>
     <w:p>
@@ -1372,7 +1372,7 @@
           <w:i w:val="0"/>
           <w:sz w:val="22"/>
         </w:rPr>
-        <w:t>The authors declare no competing interests.</w:t>
+        <w:t>The author declares no competing interests.</w:t>
       </w:r>
     </w:p>
     <w:p>
@@ -1603,7 +1603,7 @@
         <w:rPr>
           <w:sz w:val="20"/>
         </w:rPr>
-        <w:t>20. Davoli, T., Uno, H., Wooten, E. C. &amp; Elledge, S. J. Tumor aneuploidy correlates with markers of immune evasion and with reduced response to immunotherapy. Science 355, eaaf8399 (2017).</w:t>
+        <w:t>20. Valiant, L. G. A theory of the learnable. Commun. ACM 27, 1134–1142 (1984).</w:t>
       </w:r>
     </w:p>
     <w:sectPr>

</xml_diff>

<commit_message>
Revise title, affiliation, and funding for submission metadata.
Replace the over-strong title with a PAC learnability framing, record
Independent Scholar with no funding, and rebuild manuscript exports.

Co-authored-by: Cursor <cursoragent@cursor.com>
</commit_message>
<xml_diff>
--- a/manuscript/MANUSCRIPT_draft.docx
+++ b/manuscript/MANUSCRIPT_draft.docx
@@ -11,7 +11,7 @@
           <w:b/>
           <w:sz w:val="32"/>
         </w:rPr>
-        <w:t>A computable threshold below which tumours cannot evolve drug resistance</w:t>
+        <w:t>N_e*: a computable population-size threshold for resistance learnability from standard tumour sequencing</w:t>
       </w:r>
     </w:p>
     <w:p>
@@ -34,7 +34,7 @@
           <w:i/>
           <w:sz w:val="20"/>
         </w:rPr>
-        <w:t>[Affiliation — add department, institution, and country before submission]</w:t>
+        <w:t>Independent Scholar</w:t>
       </w:r>
     </w:p>
     <w:p>
@@ -813,7 +813,7 @@
           <w:i w:val="0"/>
           <w:sz w:val="22"/>
         </w:rPr>
-        <w:t>The title’s claim—that resistance cannot evolve below N_e*—is intended in the PAC sense of reliable learnability under bounded error, not as a guarantee that no resistant clone will ever appear. Empirically, patient-level and PFS tests on public data neither confirm nor refute that stronger reading; they were underpowered or used mismatched endpoints. The Broad vemurafenib cohort (fourteen events; 98% below N_e* after calibration) cannot discriminate subtle hazard differences. Larger MSK BRAF series exist but lack resistance dates in open metadata—a systematic gap in genomic archives built for genotype–survival association rather than time-to-resistance on targeted agents.</w:t>
+        <w:t>N_e* marks the PAC boundary of reliable resistance learnability under bounded error, not a guarantee that no resistant clone will ever appear. Patient-level and PFS tests on public data neither confirm nor refute finer hazard discrimination; they were underpowered or used mismatched endpoints. The Broad vemurafenib cohort (fourteen events; 98% below N_e* after calibration) cannot discriminate subtle hazard differences. Larger MSK BRAF series exist but lack resistance dates in open metadata—a systematic gap in genomic archives built for genotype–survival association rather than time-to-resistance on targeted agents.</w:t>
       </w:r>
     </w:p>
     <w:p>
@@ -1323,6 +1323,31 @@
           <w:sz w:val="22"/>
         </w:rPr>
         <w:t>The author thanks the cBioPortal and TCGA communities for open genomic and clinical data.</w:t>
+      </w:r>
+    </w:p>
+    <w:p>
+      <w:pPr>
+        <w:pStyle w:val="Heading1"/>
+      </w:pPr>
+      <w:r>
+        <w:rPr>
+          <w:rFonts w:ascii="Times New Roman" w:hAnsi="Times New Roman"/>
+        </w:rPr>
+        <w:t>Funding</w:t>
+      </w:r>
+    </w:p>
+    <w:p>
+      <w:pPr>
+        <w:spacing w:after="120" w:line="276" w:lineRule="auto"/>
+        <w:jc w:val="both"/>
+      </w:pPr>
+      <w:r>
+        <w:rPr>
+          <w:b w:val="0"/>
+          <w:i w:val="0"/>
+          <w:sz w:val="22"/>
+        </w:rPr>
+        <w:t>The author received no specific funding for this work.</w:t>
       </w:r>
     </w:p>
     <w:p>

</xml_diff>

<commit_message>
Add Supplementary Note 1 PDF, benchmark analysis, and theory preprint links.
Auto-build the PAC formalism supplement, cite the Research Square preprint
for proofs, and report head-to-head heterogeneity metric comparisons.

Co-authored-by: Cursor <cursoragent@cursor.com>
</commit_message>
<xml_diff>
--- a/manuscript/MANUSCRIPT_draft.docx
+++ b/manuscript/MANUSCRIPT_draft.docx
@@ -72,7 +72,7 @@
           <w:i w:val="0"/>
           <w:sz w:val="22"/>
         </w:rPr>
-        <w:t>Resistance to systemic therapy drives most cancer deaths, yet treatment decisions at diagnosis seldom include a quantitative estimate of evolutionary capacity to escape therapy. We define N_e*, a resistance-learnability threshold computable from standard tumour sequencing: subclonal diversity (V_A), effective population size (N_e), and an independently specified count of resistance-relevant driver loci (L). Under a fixed evolutionary tolerance (ε = 0.05) and failure probability (δ = 0.05), N_e* is the minimum population size at which resistance evolution is reliably learnable in the PAC sense (Supplementary Note 1).</w:t>
+        <w:t>Resistance to systemic therapy drives most cancer deaths, yet treatment decisions at diagnosis seldom include a quantitative estimate of evolutionary capacity to escape therapy. We define N_e*, a resistance-learnability threshold computable from standard tumour sequencing: subclonal diversity (V_A), effective population size (N_e), and an independently specified count of resistance-relevant driver loci (L). Under a fixed evolutionary tolerance (ε = 0.05) and failure probability (δ = 0.05), N_e* is the minimum population size at which resistance evolution is reliably learnable in the PAC sense (Stillwell, 2026 preprint; Supplementary Note 1).</w:t>
       </w:r>
     </w:p>
     <w:p>
@@ -149,7 +149,7 @@
         <w:rPr>
           <w:sz w:val="22"/>
         </w:rPr>
-        <w:t>ε* tracks resistance durability across 17 cancer types (r = 0.88), with no patient-level tuning.</w:t>
+        <w:t>ε* tracks resistance durability across 17 cancer types (r = 0.88); head-to-head benchmarks against V_A and N_e alone are reported transparently (Extended Data Table 5).</w:t>
       </w:r>
     </w:p>
     <w:p>
@@ -226,7 +226,7 @@
           <w:i w:val="0"/>
           <w:sz w:val="22"/>
         </w:rPr>
-        <w:t>We cast this logic as an evolutionary probably approximately correct (PAC) bound (Supplementary Note 1). For fixed ε and δ there exists a minimum N_e*(V_A, L) below which resistance evolution is sample-starved. The bound yields ε*(N_e, V_A, L), which should covary with resistance emergence when its inputs are measured independently of clinical outcome. Importantly, L is fixed from curated OncoKB/CIViC resistance panels and is not derived from log₂(N_e), avoiding circular coupling between the threshold and the population size estimate.</w:t>
+        <w:t>We cast this logic as an evolutionary probably approximately correct (PAC) bound (Stillwell, 2026 preprint; Supplementary Note 1). The hypothesis class comprises resistance by selection on N_e cells with dispersion V_A across L resistance loci; failure is missing an ε-optimal resistant state with probability exceeding δ. N_e acts as effective sample size in a large-deviation bound—not as labeled-example count in Valiant’s binary PAC setting. For fixed ε and δ there exists a minimum N_e*(V_A, L) below which resistance evolution is sample-starved. The bound yields ε*(N_e, V_A, L), which should covary with resistance emergence when its inputs are measured independently of clinical outcome. Importantly, L is fixed from curated OncoKB/CIViC resistance panels and is not derived from log₂(N_e), avoiding circular coupling between the threshold and the population size estimate.</w:t>
       </w:r>
     </w:p>
     <w:p>
@@ -276,7 +276,7 @@
           <w:i w:val="0"/>
           <w:sz w:val="22"/>
         </w:rPr>
-        <w:t>N_e* is the smallest effective population size for which the PAC failure probability does not exceed δ = 0.05 at accuracy ε = 0.05, given patient V_A and cancer-type L (Methods; Supplementary Note 1). V_A is estimated from VAF dispersion (MATH-score calibration), N_e from the subclonal VAF site-frequency spectrum (Williams et al. scaling), and L from a fixed resistance-locus panel per indication (Extended Data Table 1). Each quantity is inferable from a single pre-treatment sample when tumour purity is known or estimable.</w:t>
+        <w:t>N_e* is the smallest effective population size for which the PAC failure probability does not exceed δ = 0.05 at accuracy ε = 0.05, given patient V_A and cancer-type L (Stillwell, 2026 preprint; Methods; Supplementary Note 1). V_A is estimated from VAF dispersion (MATH-score calibration), N_e from the subclonal VAF site-frequency spectrum (Williams et al. scaling), and L from a fixed resistance-locus panel per indication (Extended Data Table 1). Each quantity is inferable from a single pre-treatment sample when tumour purity is known or estimable.</w:t>
       </w:r>
     </w:p>
     <w:p>
@@ -403,6 +403,20 @@
           <w:i w:val="0"/>
           <w:sz w:val="22"/>
         </w:rPr>
+        <w:t>Head-to-head comparison against simpler heterogeneity metrics did not show ε* to be the strongest univariate correlate on n = 17 types (Extended Data Table 5). Resistance instability correlated with V_A alone (r = 0.87), log₁₀(N_e) alone (r = −0.89), and 1/N_e alone (r = 0.91), reflecting a shared pan-cancer gradient in both genomic inputs and resistance kinetics. A bivariate model of V_A and log₁₀(N_e) explained 81% of variance (R² = 0.81); adding ε* did not improve fit (ΔR² ≈ 0; nested F-test P = 0.96). The increment of the PAC framework is therefore not superior type-level correlation, but three joint properties: L is assigned independently of N_e and V_A; inputs collapse to a single patient-level ratio N_e/N_e* on every report; and ε and δ tie the bound to an explicit learnability criterion rather than an ad hoc composite of MATH-like scores.</w:t>
+      </w:r>
+    </w:p>
+    <w:p>
+      <w:pPr>
+        <w:spacing w:after="120" w:line="276" w:lineRule="auto"/>
+        <w:jc w:val="both"/>
+      </w:pPr>
+      <w:r>
+        <w:rPr>
+          <w:b w:val="0"/>
+          <w:i w:val="0"/>
+          <w:sz w:val="22"/>
+        </w:rPr>
         <w:t>Specified before inspection of patient outcomes, this analysis is the primary empirical support for the framework: a sequence-derived evolutionary quantity tracks cross-cancer resistance ecology without regression to individual progression times.</w:t>
       </w:r>
     </w:p>
@@ -799,7 +813,7 @@
           <w:i w:val="0"/>
           <w:sz w:val="22"/>
         </w:rPr>
-        <w:t>We translate an evolutionary sample-complexity bound into N_e*, a threshold readable on standard sequencing reports, and test it at three scales. The principal finding is ecological: ε*(N_e, V_A, L), computed without reference to patient outcomes, tracks how quickly resistance emerges across seventeen cancer types (r = 0.88). That result survives leave-one-out deletion and wide perturbation of L, and does not reduce to repackaging existing heterogeneity indices because L is fixed independently of N_e.</w:t>
+        <w:t>We translate an evolutionary sample-complexity bound into N_e*, a threshold readable on standard sequencing reports, and test it at three scales. The principal ecological finding is that ε*(N_e, V_A, L), computed without reference to patient outcomes, tracks how quickly resistance emerges across seventeen cancer types (r = 0.88). That result survives leave-one-out deletion and wide perturbation of L. Benchmarking against V_A (≈MATH-calibrated) and N_e alone shows comparable univariate correlations (Extended Data Table 5); ε* does not outperform a V_A + log₁₀(N_e) composite at the type level. Its value lies in combining independently specified L with N_e and V_A into a deployable patient ratio N_e/N_e*, under an explicit learnability criterion— not in winning a seventeen-point correlation contest against established heterogeneity indices.</w:t>
       </w:r>
     </w:p>
     <w:p>
@@ -855,7 +869,7 @@
           <w:i w:val="0"/>
           <w:sz w:val="22"/>
         </w:rPr>
-        <w:t>Limitations include retrospective design, error in VAF-based N_e estimation, post hoc calibration of N_e to Williams medians (documented on OSF), and literature-derived TTR₂ for cross-cancer comparisons. The PAC landscape is simplified; full derivations appear in Supplementary Note 1. Definitive causal proof requires experimental control of effective population size—outside the scope of this observational study.</w:t>
+        <w:t>Limitations include retrospective design, error in VAF-based N_e estimation, and literature-derived TTR₂ for cross-cancer comparisons. Patient-level N_e calibration to Williams/Dentro medians (OSF deviation note) applies only to cBioPortal cohorts (Figs 3–4, Extended Data Fig. 1), not to the cross-cancer ecology analysis, which uses published type-level medians and therapy-outcome TTR₂ sources that do not overlap the calibration literature (Extended Data Table 2). Because calibration is a monotonic within-cohort scale map and Fig. 2 outcomes were never used to set anchors, the ecological correlation cannot be inflated by reusing the same dataset for input and validation. Formal definitions are summarized in Supplementary Note 1; full theorem statements and proofs are in Stillwell (2026 preprint) and are not reproduced here. Definitive causal proof requires experimental control of effective population size—outside the scope of this observational study.</w:t>
       </w:r>
     </w:p>
     <w:p>
@@ -916,7 +930,7 @@
         <w:rPr>
           <w:rFonts w:ascii="Times New Roman" w:hAnsi="Times New Roman"/>
         </w:rPr>
-        <w:t>PAC bound and N_e*</w:t>
+        <w:t>PAC bound, hypothesis class, and N_e*</w:t>
       </w:r>
     </w:p>
     <w:p>
@@ -930,7 +944,46 @@
           <w:i w:val="0"/>
           <w:sz w:val="22"/>
         </w:rPr>
-        <w:t>The bound ε*(N_e, V_A, L) = √(2 V_A [L ln(e N_e/L) + ln(4/δ)] / N_e). N_e* solves P(failure) ≤ δ at tolerance ε by bisection on the monotone PAC tail. Classification uses baseline sequencing before systemic therapy. Regression models employ log₁₀(N_e/N_e*).</w:t>
+        <w:t>Supplementary Note 1 summarizes the learning objects for reviewers; full proofs appear in Stillwell (2026 preprint, https://doi.org/10.21203/rs.3.rs-9848110/v1) and are not duplicated in this paper. Instance space: baseline bulk-sequencing summaries of resistance-relevant allele frequencies at L loci together with subclonal dispersion V_A. Hypothesis class: resistance phenotypes reachable by selection on an effective population of N_e cells. Loss: shortfall in resistance fitness relative to an ε-optimal resistant phenotype. Failure: loss exceeding ε with probability greater than δ over evolutionary trajectories. This is a continuous Fisher-information search problem; VC dimension of binary classifiers is not the operative capacity measure.</w:t>
+      </w:r>
+    </w:p>
+    <w:p>
+      <w:pPr>
+        <w:spacing w:after="120" w:line="276" w:lineRule="auto"/>
+        <w:jc w:val="both"/>
+      </w:pPr>
+      <w:r>
+        <w:rPr>
+          <w:b w:val="0"/>
+          <w:i w:val="0"/>
+          <w:sz w:val="22"/>
+        </w:rPr>
+        <w:t>The bound ε*(N_e, V_A, L) = √(2 V_A [L ln(e N_e/L) + ln(4/δ)] / N_e) follows from a large-deviation tail on resistance-allele occupancy (Chernoff–Hoeffding type), with N_e as effective sample size—analogous to sample complexity m in PAC bounds but not identical to labeled-example count in Valiant’s discrete framework (Stillwell, 2026 preprint). N_e* solves P(failure) ≤ δ at tolerance ε by bisection on the monotone PAC tail. Classification uses baseline sequencing before systemic therapy. Regression models employ log₁₀(N_e/N_e*).</w:t>
+      </w:r>
+    </w:p>
+    <w:p>
+      <w:pPr>
+        <w:pStyle w:val="Heading2"/>
+      </w:pPr>
+      <w:r>
+        <w:rPr>
+          <w:rFonts w:ascii="Times New Roman" w:hAnsi="Times New Roman"/>
+        </w:rPr>
+        <w:t>Calibration and circularity controls</w:t>
+      </w:r>
+    </w:p>
+    <w:p>
+      <w:pPr>
+        <w:spacing w:after="120" w:line="276" w:lineRule="auto"/>
+        <w:jc w:val="both"/>
+      </w:pPr>
+      <w:r>
+        <w:rPr>
+          <w:b w:val="0"/>
+          <w:i w:val="0"/>
+          <w:sz w:val="22"/>
+        </w:rPr>
+        <w:t>Cross-cancer validation (Fig. 2) uses published median N_e and V_A per type and literature TTR₂ from therapy-outcome papers (Extended Data Table 2)—no patient-level calibration is applied. Patient-level N_e from cBioPortal VAF spectra is cohort-calibrated to Williams/Dentro median anchors (OSF deviation note): a monotonic scale map preserving within-cohort rank order. Calibration affects Figs 3–4 and Extended Data Fig. 1 only. TTR₂ outcomes were not used to set calibration anchors, so ecological correlation in Fig. 2 cannot be laundered through the same literature used for validation.</w:t>
       </w:r>
     </w:p>
     <w:p>
@@ -980,7 +1033,7 @@
           <w:i w:val="0"/>
           <w:sz w:val="22"/>
         </w:rPr>
-        <w:t>Seventeen cancer types with published median N_e, V_A, independently assigned L, and TTR₂ (sources in Supplementary Table 1 and repository file cross_cancer_table.csv). Outcome: 1/TTR₂. Statistics: Pearson r; leave-one-out r; 10,000 bootstrap replicates resampling types; L sensitivity at 0.5×, 1.0×, 2.0×.</w:t>
+        <w:t>Seventeen cancer types with published median N_e, V_A, independently assigned L, and TTR₂ (sources in Supplementary Table 1 and repository file cross_cancer_table.csv). Outcome: 1/TTR₂. Statistics: Pearson r; leave-one-out r; 10,000 bootstrap replicates resampling types; L sensitivity at 0.5×, 1.0×, 2.0×. Benchmark: univariate r and OLS R² for V_A, log₁₀(N_e), 1/N_e, and ε*; nested F-test for ε* beyond V_A + log₁₀(N_e) (scripts/make_cross_cancer_benchmark.py).</w:t>
       </w:r>
     </w:p>
     <w:p>
@@ -1227,6 +1280,45 @@
     </w:p>
     <w:p>
       <w:pPr>
+        <w:pStyle w:val="Heading2"/>
+      </w:pPr>
+      <w:r>
+        <w:rPr>
+          <w:rFonts w:ascii="Times New Roman" w:hAnsi="Times New Roman"/>
+        </w:rPr>
+        <w:t>Extended Data Table 5</w:t>
+      </w:r>
+    </w:p>
+    <w:p>
+      <w:pPr>
+        <w:spacing w:after="120" w:line="276" w:lineRule="auto"/>
+        <w:jc w:val="both"/>
+      </w:pPr>
+      <w:r>
+        <w:rPr>
+          <w:b/>
+          <w:i/>
+          <w:sz w:val="22"/>
+        </w:rPr>
+        <w:t>Head-to-head benchmark against heterogeneity metrics (n = 17 types)</w:t>
+      </w:r>
+    </w:p>
+    <w:p>
+      <w:pPr>
+        <w:spacing w:after="120" w:line="276" w:lineRule="auto"/>
+        <w:jc w:val="both"/>
+      </w:pPr>
+      <w:r>
+        <w:rPr>
+          <w:b w:val="0"/>
+          <w:i w:val="0"/>
+          <w:sz w:val="22"/>
+        </w:rPr>
+        <w:t>Outcome: 1/TTR₂. V_A (MATH-calibrated): r = 0.871, LOO min r = 0.815, OLS R² = 0.758. log₁₀(N_e): r = −0.890, LOO min r = −0.911, R² = 0.792. 1/N_e: r = 0.906, LOO min r = 0.829, R² = 0.821. ε* (PAC bound): r = 0.881, LOO min r = 0.772, R² = 0.776. V_A + log₁₀(N_e): R² = 0.807. V_A + log₁₀(N_e) + L: R² = 0.820. Adding ε* to V_A + log₁₀(N_e): ΔR² ≈ 0, nested F-test P = 0.96.</w:t>
+      </w:r>
+    </w:p>
+    <w:p>
+      <w:pPr>
         <w:pStyle w:val="Heading1"/>
       </w:pPr>
       <w:r>
@@ -1247,7 +1339,7 @@
           <w:i w:val="0"/>
           <w:sz w:val="22"/>
         </w:rPr>
-        <w:t>Patient-level data are available through cBioPortal (https://www.cbioportal.org) under study accessions listed in the repository cohort manifest. Processed figure statistics and patient summary tables accompany the code release at https://github.com/rstil2/computable-resistance-threshold. Pre-registration: https://osf.io/kp5jf.</w:t>
+        <w:t>Patient-level data are available through cBioPortal (https://www.cbioportal.org) under study accessions listed in the repository cohort manifest. Processed figure statistics and patient summary tables accompany the code release at https://github.com/rstil2/computable-resistance-threshold. Pre-registration: https://osf.io/kp5jf. Theory preprint (proofs and full PAC derivation): https://doi.org/10.21203/rs.3.rs-9848110/v1. Supplementary Note 1 (definitions summary): manuscript/SUPPLEMENTARY_NOTE_1_PAC.pdf.</w:t>
       </w:r>
     </w:p>
     <w:p>
@@ -1419,7 +1511,7 @@
         <w:rPr>
           <w:sz w:val="20"/>
         </w:rPr>
-        <w:t>1. Williams, M. J. et al. Quantification of subclonal selection in cancer from bulk sequencing data. Nat. Genet. 48, 327–335 (2016).</w:t>
+        <w:t>1. Stillwell, R. C. Natural selection is empirical risk minimisation. Preprint at Research Square https://doi.org/10.21203/rs.3.rs-9848110/v1 (2026).</w:t>
       </w:r>
     </w:p>
     <w:p>
@@ -1430,7 +1522,7 @@
         <w:rPr>
           <w:sz w:val="20"/>
         </w:rPr>
-        <w:t>2. Dentro, S. C. et al. Characterizing genetic intra-tumor heterogeneity across 2,658 human cancer genomes. Cell 185, 2239–2254 (2022).</w:t>
+        <w:t>2. Williams, M. J. et al. Quantification of subclonal selection in cancer from bulk sequencing data. Nat. Genet. 48, 327–335 (2016).</w:t>
       </w:r>
     </w:p>
     <w:p>
@@ -1441,7 +1533,7 @@
         <w:rPr>
           <w:sz w:val="20"/>
         </w:rPr>
-        <w:t>3. Van Allen, E. M. et al. The genetic landscape of clinical resistance to RAF inhibition in metastatic melanoma. Cancer Discov. 4, 94–109 (2014).</w:t>
+        <w:t>3. Dentro, S. C. et al. Characterizing genetic intra-tumor heterogeneity across 2,658 human cancer genomes. Cell 185, 2239–2254 (2022).</w:t>
       </w:r>
     </w:p>
     <w:p>
@@ -1452,7 +1544,7 @@
         <w:rPr>
           <w:sz w:val="20"/>
         </w:rPr>
-        <w:t>4. Wagle, N. et al. Dissecting therapeutic resistance to RAF inhibition in melanoma by tumor genomic profiling. J. Clin. Oncol. 29, 3085–3096 (2011).</w:t>
+        <w:t>4. Van Allen, E. M. et al. The genetic landscape of clinical resistance to RAF inhibition in metastatic melanoma. Cancer Discov. 4, 94–109 (2014).</w:t>
       </w:r>
     </w:p>
     <w:p>
@@ -1463,7 +1555,7 @@
         <w:rPr>
           <w:sz w:val="20"/>
         </w:rPr>
-        <w:t>5. Mroz, E. A. &amp; Rocco, J. W. MATH, a novel measure of intratumor genetic heterogeneity, is high in poor-outcome classes of head and neck squamous cell carcinoma. Oral Oncol. 49, 211–215 (2013).</w:t>
+        <w:t>5. Wagle, N. et al. Dissecting therapeutic resistance to RAF inhibition in melanoma by tumor genomic profiling. J. Clin. Oncol. 29, 3085–3096 (2011).</w:t>
       </w:r>
     </w:p>
     <w:p>
@@ -1474,7 +1566,7 @@
         <w:rPr>
           <w:sz w:val="20"/>
         </w:rPr>
-        <w:t>6. Cerami, E. et al. The cBio cancer genomics portal: an open platform for exploring multidimensional cancer genomics data. Cancer Discov. 2, 401–404 (2012).</w:t>
+        <w:t>6. Mroz, E. A. &amp; Rocco, J. W. MATH, a novel measure of intratumor genetic heterogeneity, is high in poor-outcome classes of head and neck squamous cell carcinoma. Oral Oncol. 49, 211–215 (2013).</w:t>
       </w:r>
     </w:p>
     <w:p>
@@ -1485,7 +1577,7 @@
         <w:rPr>
           <w:sz w:val="20"/>
         </w:rPr>
-        <w:t>7. Gao, J. et al. Integrative analysis of complex cancer genomics and clinical profiles using the cBioPortal. Sci. Signal. 6, pl1 (2013).</w:t>
+        <w:t>7. Cerami, E. et al. The cBio cancer genomics portal: an open platform for exploring multidimensional cancer genomics data. Cancer Discov. 2, 401–404 (2012).</w:t>
       </w:r>
     </w:p>
     <w:p>
@@ -1496,7 +1588,7 @@
         <w:rPr>
           <w:sz w:val="20"/>
         </w:rPr>
-        <w:t>8. Shlush, L. I. et al. Tracing the origins of relapse in acute myeloid leukaemia to stem cells. Nature 547, 104–108 (2017).</w:t>
+        <w:t>8. Gao, J. et al. Integrative analysis of complex cancer genomics and clinical profiles using the cBioPortal. Sci. Signal. 6, pl1 (2013).</w:t>
       </w:r>
     </w:p>
     <w:p>
@@ -1507,7 +1599,7 @@
         <w:rPr>
           <w:sz w:val="20"/>
         </w:rPr>
-        <w:t>9. Omuro, A. &amp; DeAngelis, L. M. Glioblastoma and other malignant gliomas: a clinical review. J. Am. Med. Assoc. 310, 1842–1850 (2013).</w:t>
+        <w:t>9. Shlush, L. I. et al. Tracing the origins of relapse in acute myeloid leukaemia to stem cells. Nature 547, 104–108 (2017).</w:t>
       </w:r>
     </w:p>
     <w:p>
@@ -1518,7 +1610,7 @@
         <w:rPr>
           <w:sz w:val="20"/>
         </w:rPr>
-        <w:t>10. Oxnard, G. R. et al. Assessment of resistance mechanisms and clinical implications in patients with EGFR T790M-positive lung cancer and acquired resistance to osimertinib. J. Clin. Oncol. 35, 3482–3488 (2017).</w:t>
+        <w:t>10. Omuro, A. &amp; DeAngelis, L. M. Glioblastoma and other malignant gliomas: a clinical review. J. Am. Med. Assoc. 310, 1842–1850 (2013).</w:t>
       </w:r>
     </w:p>
     <w:p>
@@ -1529,7 +1621,7 @@
         <w:rPr>
           <w:sz w:val="20"/>
         </w:rPr>
-        <w:t>11. Hellmann, M. D. et al. Nivolumab plus ipilimumab in lung cancer with a high tumor mutational burden. N. Engl. J. Med. 378, 2093–2104 (2018).</w:t>
+        <w:t>11. Oxnard, G. R. et al. Assessment of resistance mechanisms and clinical implications in patients with EGFR T790M-positive lung cancer and acquired resistance to osimertinib. J. Clin. Oncol. 35, 3482–3488 (2017).</w:t>
       </w:r>
     </w:p>
     <w:p>
@@ -1540,7 +1632,7 @@
         <w:rPr>
           <w:sz w:val="20"/>
         </w:rPr>
-        <w:t>12. Scher, H. I. et al. Increased survival with enzalutamide in prostate cancer after chemotherapy. N. Engl. J. Med. 367, 1187–1197 (2012).</w:t>
+        <w:t>12. Hellmann, M. D. et al. Nivolumab plus ipilimumab in lung cancer with a high tumor mutational burden. N. Engl. J. Med. 378, 2093–2104 (2018).</w:t>
       </w:r>
     </w:p>
     <w:p>
@@ -1551,7 +1643,7 @@
         <w:rPr>
           <w:sz w:val="20"/>
         </w:rPr>
-        <w:t>13. Haugen, B. R. et al. 2015 American Thyroid Association management guidelines for adult patients with thyroid nodules and differentiated thyroid cancer. Thyroid 26, 1–133 (2016).</w:t>
+        <w:t>13. Scher, H. I. et al. Increased survival with enzalutamide in prostate cancer after chemotherapy. N. Engl. J. Med. 367, 1187–1197 (2012).</w:t>
       </w:r>
     </w:p>
     <w:p>
@@ -1562,7 +1654,7 @@
         <w:rPr>
           <w:sz w:val="20"/>
         </w:rPr>
-        <w:t>14. Osumi, H. et al. Resistance to anti-EGFR antibody in colorectal cancer: mechanisms and strategies. Cancers 13, 981 (2021).</w:t>
+        <w:t>14. Haugen, B. R. et al. 2015 American Thyroid Association management guidelines for adult patients with thyroid nodules and differentiated thyroid cancer. Thyroid 26, 1–133 (2016).</w:t>
       </w:r>
     </w:p>
     <w:p>
@@ -1573,7 +1665,7 @@
         <w:rPr>
           <w:sz w:val="20"/>
         </w:rPr>
-        <w:t>15. Yates, L. R. et al. Subclonal diversification of primary breast cancer revealed by multiregion sequencing. Nat. Med. 21, 751–759 (2015).</w:t>
+        <w:t>15. Osumi, H. et al. Resistance to anti-EGFR antibody in colorectal cancer: mechanisms and strategies. Cancers 13, 981 (2021).</w:t>
       </w:r>
     </w:p>
     <w:p>
@@ -1584,7 +1676,7 @@
         <w:rPr>
           <w:sz w:val="20"/>
         </w:rPr>
-        <w:t>16. McGranahan, N. &amp; Swanton, C. Clonal heterogeneity and tumor evolution: past, present, and the future. Cell 168, 613–628 (2017).</w:t>
+        <w:t>16. Yates, L. R. et al. Subclonal diversification of primary breast cancer revealed by multiregion sequencing. Nat. Med. 21, 751–759 (2015).</w:t>
       </w:r>
     </w:p>
     <w:p>
@@ -1595,7 +1687,7 @@
         <w:rPr>
           <w:sz w:val="20"/>
         </w:rPr>
-        <w:t>17. Greaves, M. &amp; Maley, C. C. Clonal evolution in cancer. Nature 481, 306–313 (2012).</w:t>
+        <w:t>17. McGranahan, N. &amp; Swanton, C. Clonal heterogeneity and tumor evolution: past, present, and the future. Cell 168, 613–628 (2017).</w:t>
       </w:r>
     </w:p>
     <w:p>
@@ -1606,7 +1698,7 @@
         <w:rPr>
           <w:sz w:val="20"/>
         </w:rPr>
-        <w:t>18. Altrock, P. M., Liu, L. L. &amp; Michor, F. The mathematics of cancer: integrating quantitative models. Nat. Rev. Cancer 15, 730–745 (2015).</w:t>
+        <w:t>18. Greaves, M. &amp; Maley, C. C. Clonal evolution in cancer. Nature 481, 306–313 (2012).</w:t>
       </w:r>
     </w:p>
     <w:p>
@@ -1617,7 +1709,7 @@
         <w:rPr>
           <w:sz w:val="20"/>
         </w:rPr>
-        <w:t>19. Gillies, R. J., Verduzco, D. &amp; Gatenby, R. A. Evolutionary dynamics of carcinogenesis and why targeted therapy does not work. Nat. Rev. Cancer 12, 487–493 (2012).</w:t>
+        <w:t>19. Altrock, P. M., Liu, L. L. &amp; Michor, F. The mathematics of cancer: integrating quantitative models. Nat. Rev. Cancer 15, 730–745 (2015).</w:t>
       </w:r>
     </w:p>
     <w:p>
@@ -1628,7 +1720,18 @@
         <w:rPr>
           <w:sz w:val="20"/>
         </w:rPr>
-        <w:t>20. Valiant, L. G. A theory of the learnable. Commun. ACM 27, 1134–1142 (1984).</w:t>
+        <w:t>20. Gillies, R. J., Verduzco, D. &amp; Gatenby, R. A. Evolutionary dynamics of carcinogenesis and why targeted therapy does not work. Nat. Rev. Cancer 12, 487–493 (2012).</w:t>
+      </w:r>
+    </w:p>
+    <w:p>
+      <w:pPr>
+        <w:spacing w:after="60"/>
+      </w:pPr>
+      <w:r>
+        <w:rPr>
+          <w:sz w:val="20"/>
+        </w:rPr>
+        <w:t>21. Valiant, L. G. A theory of the learnable. Commun. ACM 27, 1134–1142 (1984).</w:t>
       </w:r>
     </w:p>
     <w:sectPr>

</xml_diff>